<commit_message>
docs: update admin and user view documentation to clarify marker deletion functionality
</commit_message>
<xml_diff>
--- a/docs/FlyerTracker - Admin Ansicht.docx
+++ b/docs/FlyerTracker - Admin Ansicht.docx
@@ -6,8 +6,13 @@
       <w:pPr>
         <w:pStyle w:val="Title"/>
       </w:pPr>
-      <w:r>
-        <w:t>FlyerTracker App</w:t>
+      <w:proofErr w:type="spellStart"/>
+      <w:r>
+        <w:t>FlyerTracker</w:t>
+      </w:r>
+      <w:proofErr w:type="spellEnd"/>
+      <w:r>
+        <w:t xml:space="preserve"> App</w:t>
       </w:r>
     </w:p>
     <w:p>
@@ -23,7 +28,15 @@
         <w:pStyle w:val="Heading1"/>
       </w:pPr>
       <w:r>
-        <w:t>Was ist „FlyerTracker?“</w:t>
+        <w:t>Was ist „</w:t>
+      </w:r>
+      <w:proofErr w:type="spellStart"/>
+      <w:r>
+        <w:t>FlyerTracker</w:t>
+      </w:r>
+      <w:proofErr w:type="spellEnd"/>
+      <w:r>
+        <w:t>?“</w:t>
       </w:r>
     </w:p>
     <w:p>
@@ -38,20 +51,49 @@
       </w:r>
     </w:p>
     <w:p>
-      <w:r>
-        <w:t xml:space="preserve">FlyerTracker ist eine </w:t>
+      <w:proofErr w:type="spellStart"/>
+      <w:r>
+        <w:t>FlyerTracker</w:t>
+      </w:r>
+      <w:proofErr w:type="spellEnd"/>
+      <w:r>
+        <w:t xml:space="preserve"> ist eine </w:t>
       </w:r>
       <w:r>
         <w:t xml:space="preserve">Open Source Web App, welche von Vereinen selbst betrieben werden kann. </w:t>
       </w:r>
       <w:r>
-        <w:t xml:space="preserve">Das Benutzer Interface ist für die Verwendung auf SmartPhones optimiert und so einfach wie möglich gehalten. </w:t>
+        <w:t xml:space="preserve">Das Benutzer Interface ist für die Verwendung auf </w:t>
+      </w:r>
+      <w:proofErr w:type="spellStart"/>
+      <w:r>
+        <w:t>SmartPhones</w:t>
+      </w:r>
+      <w:proofErr w:type="spellEnd"/>
+      <w:r>
+        <w:t xml:space="preserve"> optimiert und so einfach wie möglich gehalten. </w:t>
       </w:r>
       <w:r>
         <w:t xml:space="preserve">„leichter“ Programmcode und geringe Datenmengen ermöglichen die Nutzung auch an Stellen, die schlecht mit Mobilfunk abgedeckt sind. </w:t>
       </w:r>
       <w:r>
-        <w:t>Als Web App ist FlyerTracker unabhängig von der Plattform und funktioniert auf Android, iOS, macOS, Windows und Linux.</w:t>
+        <w:t xml:space="preserve">Als Web App ist </w:t>
+      </w:r>
+      <w:proofErr w:type="spellStart"/>
+      <w:r>
+        <w:t>FlyerTracker</w:t>
+      </w:r>
+      <w:proofErr w:type="spellEnd"/>
+      <w:r>
+        <w:t xml:space="preserve"> unabhängig von der Plattform und funktioniert auf Android, iOS, </w:t>
+      </w:r>
+      <w:proofErr w:type="spellStart"/>
+      <w:r>
+        <w:t>macOS</w:t>
+      </w:r>
+      <w:proofErr w:type="spellEnd"/>
+      <w:r>
+        <w:t>, Windows und Linux.</w:t>
       </w:r>
     </w:p>
     <w:p>
@@ -174,6 +216,9 @@
       </w:r>
     </w:p>
     <w:p>
+      <w:pPr>
+        <w:jc w:val="center"/>
+      </w:pPr>
       <w:r>
         <w:rPr>
           <w:noProof/>
@@ -516,7 +561,15 @@
         <w:t>Größe 12x12</w:t>
       </w:r>
       <w:r>
-        <w:t xml:space="preserve">(px) </w:t>
+        <w:t>(</w:t>
+      </w:r>
+      <w:proofErr w:type="spellStart"/>
+      <w:r>
+        <w:t>px</w:t>
+      </w:r>
+      <w:proofErr w:type="spellEnd"/>
+      <w:r>
+        <w:t xml:space="preserve">) </w:t>
       </w:r>
       <w:r>
         <w:t>monochrom</w:t>
@@ -695,6 +748,9 @@
       </w:r>
     </w:p>
     <w:p>
+      <w:pPr>
+        <w:jc w:val="center"/>
+      </w:pPr>
       <w:r>
         <w:rPr>
           <w:noProof/>
@@ -762,6 +818,9 @@
       </w:r>
     </w:p>
     <w:p>
+      <w:pPr>
+        <w:jc w:val="center"/>
+      </w:pPr>
       <w:r>
         <w:rPr>
           <w:noProof/>
@@ -1101,6 +1160,7 @@
     </w:p>
     <w:p>
       <w:pPr>
+        <w:jc w:val="center"/>
         <w:rPr>
           <w:noProof/>
         </w:rPr>
@@ -1168,11 +1228,24 @@
         <w:rPr>
           <w:noProof/>
         </w:rPr>
-        <w:t xml:space="preserve"> Marker auf der Karte auch bearbeitet / verschoben werden:</w:t>
-      </w:r>
-    </w:p>
-    <w:p>
-      <w:pPr>
+        <w:t xml:space="preserve"> Marker auf der Karte auch bearbeitet / verschoben</w:t>
+      </w:r>
+      <w:r>
+        <w:rPr>
+          <w:noProof/>
+        </w:rPr>
+        <w:t xml:space="preserve"> / gelöscht</w:t>
+      </w:r>
+      <w:r>
+        <w:rPr>
+          <w:noProof/>
+        </w:rPr>
+        <w:t xml:space="preserve"> werden:</w:t>
+      </w:r>
+    </w:p>
+    <w:p>
+      <w:pPr>
+        <w:jc w:val="center"/>
         <w:rPr>
           <w:noProof/>
         </w:rPr>
@@ -1182,16 +1255,16 @@
           <w:noProof/>
         </w:rPr>
         <w:drawing>
-          <wp:anchor distT="0" distB="0" distL="114300" distR="114300" simplePos="0" relativeHeight="251658240" behindDoc="0" locked="0" layoutInCell="1" allowOverlap="1" wp14:anchorId="2E65DA1A" wp14:editId="33F27D95">
+          <wp:anchor distT="0" distB="0" distL="114300" distR="114300" simplePos="0" relativeHeight="251658240" behindDoc="0" locked="0" layoutInCell="1" allowOverlap="1" wp14:anchorId="2E65DA1A" wp14:editId="7F6EA20E">
             <wp:simplePos x="0" y="0"/>
             <wp:positionH relativeFrom="column">
-              <wp:posOffset>4106545</wp:posOffset>
+              <wp:posOffset>4092575</wp:posOffset>
             </wp:positionH>
             <wp:positionV relativeFrom="paragraph">
-              <wp:posOffset>1524000</wp:posOffset>
+              <wp:posOffset>1767839</wp:posOffset>
             </wp:positionV>
-            <wp:extent cx="320040" cy="320040"/>
-            <wp:effectExtent l="19050" t="0" r="0" b="22860"/>
+            <wp:extent cx="274798" cy="320040"/>
+            <wp:effectExtent l="19050" t="0" r="0" b="3810"/>
             <wp:wrapNone/>
             <wp:docPr id="1525388662" name="Graphic 1" descr="Right pointing backhand index with solid fill"/>
             <wp:cNvGraphicFramePr>
@@ -1219,7 +1292,7 @@
                   <pic:spPr>
                     <a:xfrm rot="13285158">
                       <a:off x="0" y="0"/>
-                      <a:ext cx="320040" cy="320040"/>
+                      <a:ext cx="274798" cy="320040"/>
                     </a:xfrm>
                     <a:prstGeom prst="rect">
                       <a:avLst/>
@@ -1242,8 +1315,8 @@
           <w:noProof/>
         </w:rPr>
         <w:drawing>
-          <wp:inline distT="0" distB="0" distL="0" distR="0" wp14:anchorId="1A707644" wp14:editId="3D1E59AD">
-            <wp:extent cx="5760720" cy="3824605"/>
+          <wp:inline distT="0" distB="0" distL="0" distR="0" wp14:anchorId="1A707644" wp14:editId="524BFB3B">
+            <wp:extent cx="4784783" cy="3824605"/>
             <wp:effectExtent l="0" t="0" r="0" b="4445"/>
             <wp:docPr id="2110513060" name="Picture 1"/>
             <wp:cNvGraphicFramePr>
@@ -1253,11 +1326,17 @@
               <a:graphicData uri="http://schemas.openxmlformats.org/drawingml/2006/picture">
                 <pic:pic xmlns:pic="http://schemas.openxmlformats.org/drawingml/2006/picture">
                   <pic:nvPicPr>
-                    <pic:cNvPr id="2110513060" name=""/>
+                    <pic:cNvPr id="2110513060" name="Picture 1"/>
                     <pic:cNvPicPr/>
                   </pic:nvPicPr>
                   <pic:blipFill>
-                    <a:blip r:embed="rId17"/>
+                    <a:blip r:embed="rId17" cstate="print">
+                      <a:extLst>
+                        <a:ext uri="{28A0092B-C50C-407E-A947-70E740481C1C}">
+                          <a14:useLocalDpi xmlns:a14="http://schemas.microsoft.com/office/drawing/2010/main" val="0"/>
+                        </a:ext>
+                      </a:extLst>
+                    </a:blip>
                     <a:stretch>
                       <a:fillRect/>
                     </a:stretch>
@@ -1265,7 +1344,7 @@
                   <pic:spPr>
                     <a:xfrm>
                       <a:off x="0" y="0"/>
-                      <a:ext cx="5760720" cy="3824605"/>
+                      <a:ext cx="4784783" cy="3824605"/>
                     </a:xfrm>
                     <a:prstGeom prst="rect">
                       <a:avLst/>

</xml_diff>